<commit_message>
docs(activity): add 5.3 staged test history from existing reports to test report
Co-Authored-By: Claude Sonnet 5.5 <noreply@anthropic.com>
</commit_message>
<xml_diff>
--- a/docs/activity/산출물/멀티에이전트_테스트_계획_및_결과_보고서_활동에이전트_2026-10-14.docx
+++ b/docs/activity/산출물/멀티에이전트_테스트_계획_및_결과_보고서_활동에이전트_2026-10-14.docx
@@ -9311,6 +9311,1564 @@
                 <w:rtl w:val="0"/>
               </w:rPr>
               <w:t xml:space="preserve">코드가 후보를 고르고 LLM 은 보여줄 3곳의 순서만 정하게 제한, 순서 변경 시 사유 필수(없으면 거부)</w:t>
+            </w:r>
+          </w:p>
+        </w:tc>
+      </w:tr>
+    </w:tbl>
+    <w:p>
+      <w:pPr>
+        <w:pStyle w:val="Heading3"/>
+        <w:keepNext w:val="0"/>
+        <w:keepLines w:val="0"/>
+        <w:spacing w:before="280" w:lineRule="auto"/>
+        <w:rPr>
+          <w:rFonts w:ascii="Malgun Gothic" w:cs="Malgun Gothic" w:eastAsia="Malgun Gothic" w:hAnsi="Malgun Gothic"/>
+          <w:b w:val="1"/>
+          <w:bCs w:val="1"/>
+          <w:color w:val="000000"/>
+          <w:sz w:val="26"/>
+          <w:szCs w:val="26"/>
+        </w:rPr>
+      </w:pPr>
+      <w:bookmarkStart w:colFirst="0" w:colLast="0" w:name="_22rj76yn2mnd" w:id="19"/>
+      <w:bookmarkEnd w:id="19"/>
+      <w:r>
+        <w:rPr>
+          <w:rFonts w:ascii="Malgun Gothic" w:cs="Malgun Gothic" w:eastAsia="Malgun Gothic" w:hAnsi="Malgun Gothic"/>
+          <w:b w:val="1"/>
+          <w:bCs w:val="1"/>
+          <w:color w:val="000000"/>
+          <w:sz w:val="26"/>
+          <w:szCs w:val="26"/>
+          <w:rtl w:val="0"/>
+        </w:rPr>
+        <w:t xml:space="preserve">5.3 단계별 시험 이력 (작업 중 남긴 리포트의 실측 기록)</w:t>
+      </w:r>
+    </w:p>
+    <w:p>
+      <w:pPr>
+        <w:numPr>
+          <w:ilvl w:val="0"/>
+          <w:numId w:val="2"/>
+        </w:numPr>
+        <w:spacing w:after="0" w:afterAutospacing="0" w:before="240" w:lineRule="auto"/>
+        <w:ind w:left="720" w:hanging="360"/>
+        <w:rPr>
+          <w:rFonts w:ascii="Malgun Gothic" w:cs="Malgun Gothic" w:eastAsia="Malgun Gothic" w:hAnsi="Malgun Gothic"/>
+          <w:b w:val="0"/>
+          <w:bCs w:val="0"/>
+          <w:color w:val="0000ff"/>
+        </w:rPr>
+      </w:pPr>
+      <w:r>
+        <w:rPr>
+          <w:rFonts w:ascii="Malgun Gothic" w:cs="Malgun Gothic" w:eastAsia="Malgun Gothic" w:hAnsi="Malgun Gothic"/>
+          <w:b w:val="0"/>
+          <w:bCs w:val="0"/>
+          <w:color w:val="0000ff"/>
+          <w:rtl w:val="0"/>
+        </w:rPr>
+        <w:t xml:space="preserve">아래는 구현 단계마다 돌린 시험·실측이 당시 리포트(wiki/records/reports, 활동 리포트 12건)에 적힌 그대로이다. 시험 범위(전체 스위트인지 일부인지)와 실행 환경이 시점마다 달라 건수를 서로 더하거나 비교할 수 없다. 5.1 의 종합 표는 2026-10-14 에 한 번 일관되게 다시 실행한 값이다.</w:t>
+      </w:r>
+    </w:p>
+    <w:tbl>
+      <w:tblPr>
+        <w:tblStyle w:val="Table13"/>
+        <w:tblW w:w="9480.0" w:type="dxa"/>
+        <w:jc w:val="center"/>
+        <w:tblBorders>
+          <w:top w:color="808080" w:space="0" w:sz="7" w:val="single"/>
+          <w:left w:color="808080" w:space="0" w:sz="7" w:val="single"/>
+          <w:bottom w:color="808080" w:space="0" w:sz="7" w:val="single"/>
+          <w:right w:color="808080" w:space="0" w:sz="7" w:val="single"/>
+          <w:insideH w:color="808080" w:space="0" w:sz="7" w:val="single"/>
+          <w:insideV w:color="808080" w:space="0" w:sz="7" w:val="single"/>
+        </w:tblBorders>
+        <w:tblLayout w:type="fixed"/>
+        <w:tblLook w:val="0600"/>
+      </w:tblPr>
+      <w:tblGrid>
+        <w:gridCol w:w="1835"/>
+        <w:gridCol w:w="3545"/>
+        <w:gridCol w:w="4100"/>
+        <w:tblGridChange w:id="0">
+          <w:tblGrid>
+            <w:gridCol w:w="1835"/>
+            <w:gridCol w:w="3545"/>
+            <w:gridCol w:w="4100"/>
+          </w:tblGrid>
+        </w:tblGridChange>
+      </w:tblGrid>
+      <w:tr>
+        <w:trPr>
+          <w:cantSplit w:val="0"/>
+          <w:trHeight w:val="566.9291338582677" w:hRule="atLeast"/>
+          <w:tblHeader w:val="0"/>
+        </w:trPr>
+        <w:tc>
+          <w:tcPr>
+            <w:tcBorders>
+              <w:top w:color="808080" w:space="0" w:sz="7" w:val="single"/>
+              <w:left w:color="808080" w:space="0" w:sz="7" w:val="single"/>
+              <w:bottom w:color="808080" w:space="0" w:sz="7" w:val="single"/>
+              <w:right w:color="808080" w:space="0" w:sz="7" w:val="single"/>
+            </w:tcBorders>
+            <w:shd w:fill="cfe2f3" w:val="clear"/>
+            <w:tcMar>
+              <w:top w:w="100.0" w:type="dxa"/>
+              <w:left w:w="100.0" w:type="dxa"/>
+              <w:bottom w:w="100.0" w:type="dxa"/>
+              <w:right w:w="100.0" w:type="dxa"/>
+            </w:tcMar>
+            <w:vAlign w:val="top"/>
+          </w:tcPr>
+          <w:p>
+            <w:pPr>
+              <w:spacing w:after="0" w:before="0" w:line="240" w:lineRule="auto"/>
+              <w:jc w:val="center"/>
+              <w:rPr>
+                <w:rFonts w:ascii="Malgun Gothic" w:cs="Malgun Gothic" w:eastAsia="Malgun Gothic" w:hAnsi="Malgun Gothic"/>
+              </w:rPr>
+            </w:pPr>
+            <w:r>
+              <w:rPr>
+                <w:rFonts w:ascii="Malgun Gothic" w:cs="Malgun Gothic" w:eastAsia="Malgun Gothic" w:hAnsi="Malgun Gothic"/>
+                <w:rtl w:val="0"/>
+              </w:rPr>
+              <w:t xml:space="preserve">일자 · 단계</w:t>
+            </w:r>
+          </w:p>
+        </w:tc>
+        <w:tc>
+          <w:tcPr>
+            <w:tcBorders>
+              <w:top w:color="808080" w:space="0" w:sz="7" w:val="single"/>
+              <w:left w:color="808080" w:space="0" w:sz="7" w:val="single"/>
+              <w:bottom w:color="808080" w:space="0" w:sz="7" w:val="single"/>
+              <w:right w:color="808080" w:space="0" w:sz="7" w:val="single"/>
+            </w:tcBorders>
+            <w:shd w:fill="cfe2f3" w:val="clear"/>
+            <w:tcMar>
+              <w:top w:w="100.0" w:type="dxa"/>
+              <w:left w:w="100.0" w:type="dxa"/>
+              <w:bottom w:w="100.0" w:type="dxa"/>
+              <w:right w:w="100.0" w:type="dxa"/>
+            </w:tcMar>
+            <w:vAlign w:val="top"/>
+          </w:tcPr>
+          <w:p>
+            <w:pPr>
+              <w:spacing w:after="0" w:before="0" w:line="240" w:lineRule="auto"/>
+              <w:jc w:val="center"/>
+              <w:rPr>
+                <w:rFonts w:ascii="Malgun Gothic" w:cs="Malgun Gothic" w:eastAsia="Malgun Gothic" w:hAnsi="Malgun Gothic"/>
+              </w:rPr>
+            </w:pPr>
+            <w:r>
+              <w:rPr>
+                <w:rFonts w:ascii="Malgun Gothic" w:cs="Malgun Gothic" w:eastAsia="Malgun Gothic" w:hAnsi="Malgun Gothic"/>
+                <w:rtl w:val="0"/>
+              </w:rPr>
+              <w:t xml:space="preserve">당시 실행한 시험·실측 결과</w:t>
+            </w:r>
+          </w:p>
+        </w:tc>
+        <w:tc>
+          <w:tcPr>
+            <w:tcBorders>
+              <w:top w:color="808080" w:space="0" w:sz="7" w:val="single"/>
+              <w:left w:color="808080" w:space="0" w:sz="7" w:val="single"/>
+              <w:bottom w:color="808080" w:space="0" w:sz="7" w:val="single"/>
+              <w:right w:color="808080" w:space="0" w:sz="7" w:val="single"/>
+            </w:tcBorders>
+            <w:shd w:fill="cfe2f3" w:val="clear"/>
+            <w:tcMar>
+              <w:top w:w="100.0" w:type="dxa"/>
+              <w:left w:w="100.0" w:type="dxa"/>
+              <w:bottom w:w="100.0" w:type="dxa"/>
+              <w:right w:w="100.0" w:type="dxa"/>
+            </w:tcMar>
+            <w:vAlign w:val="top"/>
+          </w:tcPr>
+          <w:p>
+            <w:pPr>
+              <w:spacing w:after="0" w:before="0" w:line="240" w:lineRule="auto"/>
+              <w:jc w:val="center"/>
+              <w:rPr>
+                <w:rFonts w:ascii="Malgun Gothic" w:cs="Malgun Gothic" w:eastAsia="Malgun Gothic" w:hAnsi="Malgun Gothic"/>
+              </w:rPr>
+            </w:pPr>
+            <w:r>
+              <w:rPr>
+                <w:rFonts w:ascii="Malgun Gothic" w:cs="Malgun Gothic" w:eastAsia="Malgun Gothic" w:hAnsi="Malgun Gothic"/>
+                <w:rtl w:val="0"/>
+              </w:rPr>
+              <w:t xml:space="preserve">발견한 문제와 조치</w:t>
+            </w:r>
+          </w:p>
+        </w:tc>
+      </w:tr>
+      <w:tr>
+        <w:trPr>
+          <w:cantSplit w:val="0"/>
+          <w:trHeight w:val="566.9291338582677" w:hRule="atLeast"/>
+          <w:tblHeader w:val="0"/>
+        </w:trPr>
+        <w:tc>
+          <w:tcPr>
+            <w:tcBorders>
+              <w:top w:color="808080" w:space="0" w:sz="7" w:val="single"/>
+              <w:left w:color="808080" w:space="0" w:sz="7" w:val="single"/>
+              <w:bottom w:color="808080" w:space="0" w:sz="7" w:val="single"/>
+              <w:right w:color="808080" w:space="0" w:sz="7" w:val="single"/>
+            </w:tcBorders>
+            <w:tcMar>
+              <w:top w:w="100.0" w:type="dxa"/>
+              <w:left w:w="100.0" w:type="dxa"/>
+              <w:bottom w:w="100.0" w:type="dxa"/>
+              <w:right w:w="100.0" w:type="dxa"/>
+            </w:tcMar>
+            <w:vAlign w:val="top"/>
+          </w:tcPr>
+          <w:p>
+            <w:pPr>
+              <w:spacing w:after="0" w:before="0" w:line="240" w:lineRule="auto"/>
+              <w:jc w:val="center"/>
+              <w:rPr>
+                <w:rFonts w:ascii="Malgun Gothic" w:cs="Malgun Gothic" w:eastAsia="Malgun Gothic" w:hAnsi="Malgun Gothic"/>
+                <w:b w:val="0"/>
+                <w:bCs w:val="0"/>
+                <w:color w:val="0000ff"/>
+              </w:rPr>
+            </w:pPr>
+            <w:r>
+              <w:rPr>
+                <w:rFonts w:ascii="Malgun Gothic" w:cs="Malgun Gothic" w:eastAsia="Malgun Gothic" w:hAnsi="Malgun Gothic"/>
+                <w:b w:val="0"/>
+                <w:bCs w:val="0"/>
+                <w:color w:val="0000ff"/>
+                <w:rtl w:val="0"/>
+              </w:rPr>
+              <w:t xml:space="preserve">2026-09-28 · 팀 공용 브랜치 작업 전수검수</w:t>
+            </w:r>
+          </w:p>
+        </w:tc>
+        <w:tc>
+          <w:tcPr>
+            <w:tcBorders>
+              <w:top w:color="808080" w:space="0" w:sz="7" w:val="single"/>
+              <w:left w:color="808080" w:space="0" w:sz="7" w:val="single"/>
+              <w:bottom w:color="808080" w:space="0" w:sz="7" w:val="single"/>
+              <w:right w:color="808080" w:space="0" w:sz="7" w:val="single"/>
+            </w:tcBorders>
+            <w:tcMar>
+              <w:top w:w="100.0" w:type="dxa"/>
+              <w:left w:w="100.0" w:type="dxa"/>
+              <w:bottom w:w="100.0" w:type="dxa"/>
+              <w:right w:w="100.0" w:type="dxa"/>
+            </w:tcMar>
+            <w:vAlign w:val="top"/>
+          </w:tcPr>
+          <w:p>
+            <w:pPr>
+              <w:spacing w:after="0" w:before="0" w:line="240" w:lineRule="auto"/>
+              <w:jc w:val="center"/>
+              <w:rPr>
+                <w:rFonts w:ascii="Malgun Gothic" w:cs="Malgun Gothic" w:eastAsia="Malgun Gothic" w:hAnsi="Malgun Gothic"/>
+                <w:b w:val="0"/>
+                <w:bCs w:val="0"/>
+                <w:color w:val="0000ff"/>
+              </w:rPr>
+            </w:pPr>
+            <w:r>
+              <w:rPr>
+                <w:rFonts w:ascii="Malgun Gothic" w:cs="Malgun Gothic" w:eastAsia="Malgun Gothic" w:hAnsi="Malgun Gothic"/>
+                <w:b w:val="0"/>
+                <w:bCs w:val="0"/>
+                <w:color w:val="0000ff"/>
+                <w:rtl w:val="0"/>
+              </w:rPr>
+              <w:t xml:space="preserve">파일 75개 전수 검수. 자동 시험 1,612 통과 · 64 건너뜀 · 0 실패(96%). 변경 전후를 같은 조건으로 비교한 3개 상황 모두 확인. (09-29 통합 후: 구조·계약·단위 1,779 통과, 여행 통합 150/150)</w:t>
+            </w:r>
+          </w:p>
+        </w:tc>
+        <w:tc>
+          <w:tcPr>
+            <w:tcBorders>
+              <w:top w:color="808080" w:space="0" w:sz="7" w:val="single"/>
+              <w:left w:color="808080" w:space="0" w:sz="7" w:val="single"/>
+              <w:bottom w:color="808080" w:space="0" w:sz="7" w:val="single"/>
+              <w:right w:color="808080" w:space="0" w:sz="7" w:val="single"/>
+            </w:tcBorders>
+            <w:tcMar>
+              <w:top w:w="100.0" w:type="dxa"/>
+              <w:left w:w="100.0" w:type="dxa"/>
+              <w:bottom w:w="100.0" w:type="dxa"/>
+              <w:right w:w="100.0" w:type="dxa"/>
+            </w:tcMar>
+            <w:vAlign w:val="top"/>
+          </w:tcPr>
+          <w:p>
+            <w:pPr>
+              <w:spacing w:after="0" w:before="0" w:line="240" w:lineRule="auto"/>
+              <w:jc w:val="center"/>
+              <w:rPr>
+                <w:rFonts w:ascii="Malgun Gothic" w:cs="Malgun Gothic" w:eastAsia="Malgun Gothic" w:hAnsi="Malgun Gothic"/>
+                <w:b w:val="0"/>
+                <w:bCs w:val="0"/>
+                <w:color w:val="0000ff"/>
+              </w:rPr>
+            </w:pPr>
+            <w:r>
+              <w:rPr>
+                <w:rFonts w:ascii="Malgun Gothic" w:cs="Malgun Gothic" w:eastAsia="Malgun Gothic" w:hAnsi="Malgun Gothic"/>
+                <w:b w:val="0"/>
+                <w:bCs w:val="0"/>
+                <w:color w:val="0000ff"/>
+                <w:rtl w:val="0"/>
+              </w:rPr>
+              <w:t xml:space="preserve">날씨·재난 값을 못 받으면 건너뛰고 「성립」으로 답함(「값을 모를 때」 결정과 반대), 재난문자 칸 이름 불일치로 판단에 「없음」으로 전달. 판단 부분은 기존 코드를 유지하고 쓸 만한 부분만 골라 반영하기로 함</w:t>
+            </w:r>
+          </w:p>
+        </w:tc>
+      </w:tr>
+      <w:tr>
+        <w:trPr>
+          <w:cantSplit w:val="0"/>
+          <w:trHeight w:val="566.9291338582677" w:hRule="atLeast"/>
+          <w:tblHeader w:val="0"/>
+        </w:trPr>
+        <w:tc>
+          <w:tcPr>
+            <w:tcBorders>
+              <w:top w:color="808080" w:space="0" w:sz="7" w:val="single"/>
+              <w:left w:color="808080" w:space="0" w:sz="7" w:val="single"/>
+              <w:bottom w:color="808080" w:space="0" w:sz="7" w:val="single"/>
+              <w:right w:color="808080" w:space="0" w:sz="7" w:val="single"/>
+            </w:tcBorders>
+            <w:tcMar>
+              <w:top w:w="100.0" w:type="dxa"/>
+              <w:left w:w="100.0" w:type="dxa"/>
+              <w:bottom w:w="100.0" w:type="dxa"/>
+              <w:right w:w="100.0" w:type="dxa"/>
+            </w:tcMar>
+            <w:vAlign w:val="top"/>
+          </w:tcPr>
+          <w:p>
+            <w:pPr>
+              <w:spacing w:after="0" w:before="0" w:line="240" w:lineRule="auto"/>
+              <w:jc w:val="center"/>
+              <w:rPr>
+                <w:rFonts w:ascii="Malgun Gothic" w:cs="Malgun Gothic" w:eastAsia="Malgun Gothic" w:hAnsi="Malgun Gothic"/>
+                <w:b w:val="0"/>
+                <w:bCs w:val="0"/>
+                <w:color w:val="0000ff"/>
+              </w:rPr>
+            </w:pPr>
+            <w:r>
+              <w:rPr>
+                <w:rFonts w:ascii="Malgun Gothic" w:cs="Malgun Gothic" w:eastAsia="Malgun Gothic" w:hAnsi="Malgun Gothic"/>
+                <w:b w:val="0"/>
+                <w:bCs w:val="0"/>
+                <w:color w:val="0000ff"/>
+                <w:rtl w:val="0"/>
+              </w:rPr>
+              <w:t xml:space="preserve">2026-10-01~02 · develop 새 작업 반영</w:t>
+            </w:r>
+          </w:p>
+        </w:tc>
+        <w:tc>
+          <w:tcPr>
+            <w:tcBorders>
+              <w:top w:color="808080" w:space="0" w:sz="7" w:val="single"/>
+              <w:left w:color="808080" w:space="0" w:sz="7" w:val="single"/>
+              <w:bottom w:color="808080" w:space="0" w:sz="7" w:val="single"/>
+              <w:right w:color="808080" w:space="0" w:sz="7" w:val="single"/>
+            </w:tcBorders>
+            <w:tcMar>
+              <w:top w:w="100.0" w:type="dxa"/>
+              <w:left w:w="100.0" w:type="dxa"/>
+              <w:bottom w:w="100.0" w:type="dxa"/>
+              <w:right w:w="100.0" w:type="dxa"/>
+            </w:tcMar>
+            <w:vAlign w:val="top"/>
+          </w:tcPr>
+          <w:p>
+            <w:pPr>
+              <w:spacing w:after="0" w:before="0" w:line="240" w:lineRule="auto"/>
+              <w:jc w:val="center"/>
+              <w:rPr>
+                <w:rFonts w:ascii="Malgun Gothic" w:cs="Malgun Gothic" w:eastAsia="Malgun Gothic" w:hAnsi="Malgun Gothic"/>
+                <w:b w:val="0"/>
+                <w:bCs w:val="0"/>
+                <w:color w:val="0000ff"/>
+              </w:rPr>
+            </w:pPr>
+            <w:r>
+              <w:rPr>
+                <w:rFonts w:ascii="Malgun Gothic" w:cs="Malgun Gothic" w:eastAsia="Malgun Gothic" w:hAnsi="Malgun Gothic"/>
+                <w:b w:val="0"/>
+                <w:bCs w:val="0"/>
+                <w:color w:val="0000ff"/>
+                <w:rtl w:val="0"/>
+              </w:rPr>
+              <w:t xml:space="preserve">시험 2,454/2,455 통과(99.96%, 실패 1건은 이동 팀 시험으로 전체 실행에서만 실패). 새 단위 시험 55건 + e2e 1건. 코덱스 독립 검토 4/4. 같은 데이터로 두 코드 비교</w:t>
+            </w:r>
+          </w:p>
+        </w:tc>
+        <w:tc>
+          <w:tcPr>
+            <w:tcBorders>
+              <w:top w:color="808080" w:space="0" w:sz="7" w:val="single"/>
+              <w:left w:color="808080" w:space="0" w:sz="7" w:val="single"/>
+              <w:bottom w:color="808080" w:space="0" w:sz="7" w:val="single"/>
+              <w:right w:color="808080" w:space="0" w:sz="7" w:val="single"/>
+            </w:tcBorders>
+            <w:tcMar>
+              <w:top w:w="100.0" w:type="dxa"/>
+              <w:left w:w="100.0" w:type="dxa"/>
+              <w:bottom w:w="100.0" w:type="dxa"/>
+              <w:right w:w="100.0" w:type="dxa"/>
+            </w:tcMar>
+            <w:vAlign w:val="top"/>
+          </w:tcPr>
+          <w:p>
+            <w:pPr>
+              <w:spacing w:after="0" w:before="0" w:line="240" w:lineRule="auto"/>
+              <w:jc w:val="center"/>
+              <w:rPr>
+                <w:rFonts w:ascii="Malgun Gothic" w:cs="Malgun Gothic" w:eastAsia="Malgun Gothic" w:hAnsi="Malgun Gothic"/>
+                <w:b w:val="0"/>
+                <w:bCs w:val="0"/>
+                <w:color w:val="0000ff"/>
+              </w:rPr>
+            </w:pPr>
+            <w:r>
+              <w:rPr>
+                <w:rFonts w:ascii="Malgun Gothic" w:cs="Malgun Gothic" w:eastAsia="Malgun Gothic" w:hAnsi="Malgun Gothic"/>
+                <w:b w:val="0"/>
+                <w:bCs w:val="0"/>
+                <w:color w:val="0000ff"/>
+                <w:rtl w:val="0"/>
+              </w:rPr>
+              <w:t xml:space="preserve">「매주 일요일 / 월요일」처럼 슬래시 뒤 요일을 놓쳐 월요일 휴무를 「연다」로 읽음(2건) → 수정. 결론이 갈린 행 6건 → 고친 뒤 4건</w:t>
+            </w:r>
+          </w:p>
+        </w:tc>
+      </w:tr>
+      <w:tr>
+        <w:trPr>
+          <w:cantSplit w:val="0"/>
+          <w:trHeight w:val="566.9291338582677" w:hRule="atLeast"/>
+          <w:tblHeader w:val="0"/>
+        </w:trPr>
+        <w:tc>
+          <w:tcPr>
+            <w:tcBorders>
+              <w:top w:color="808080" w:space="0" w:sz="7" w:val="single"/>
+              <w:left w:color="808080" w:space="0" w:sz="7" w:val="single"/>
+              <w:bottom w:color="808080" w:space="0" w:sz="7" w:val="single"/>
+              <w:right w:color="808080" w:space="0" w:sz="7" w:val="single"/>
+            </w:tcBorders>
+            <w:tcMar>
+              <w:top w:w="100.0" w:type="dxa"/>
+              <w:left w:w="100.0" w:type="dxa"/>
+              <w:bottom w:w="100.0" w:type="dxa"/>
+              <w:right w:w="100.0" w:type="dxa"/>
+            </w:tcMar>
+            <w:vAlign w:val="top"/>
+          </w:tcPr>
+          <w:p>
+            <w:pPr>
+              <w:spacing w:after="0" w:before="0" w:line="240" w:lineRule="auto"/>
+              <w:jc w:val="center"/>
+              <w:rPr>
+                <w:rFonts w:ascii="Malgun Gothic" w:cs="Malgun Gothic" w:eastAsia="Malgun Gothic" w:hAnsi="Malgun Gothic"/>
+                <w:b w:val="0"/>
+                <w:bCs w:val="0"/>
+                <w:color w:val="0000ff"/>
+              </w:rPr>
+            </w:pPr>
+            <w:r>
+              <w:rPr>
+                <w:rFonts w:ascii="Malgun Gothic" w:cs="Malgun Gothic" w:eastAsia="Malgun Gothic" w:hAnsi="Malgun Gothic"/>
+                <w:b w:val="0"/>
+                <w:bCs w:val="0"/>
+                <w:color w:val="0000ff"/>
+                <w:rtl w:val="0"/>
+              </w:rPr>
+              <w:t xml:space="preserve">2026-10-06 · LLM 1단계 스파이크(실측)</w:t>
+            </w:r>
+          </w:p>
+        </w:tc>
+        <w:tc>
+          <w:tcPr>
+            <w:tcBorders>
+              <w:top w:color="808080" w:space="0" w:sz="7" w:val="single"/>
+              <w:left w:color="808080" w:space="0" w:sz="7" w:val="single"/>
+              <w:bottom w:color="808080" w:space="0" w:sz="7" w:val="single"/>
+              <w:right w:color="808080" w:space="0" w:sz="7" w:val="single"/>
+            </w:tcBorders>
+            <w:tcMar>
+              <w:top w:w="100.0" w:type="dxa"/>
+              <w:left w:w="100.0" w:type="dxa"/>
+              <w:bottom w:w="100.0" w:type="dxa"/>
+              <w:right w:w="100.0" w:type="dxa"/>
+            </w:tcMar>
+            <w:vAlign w:val="top"/>
+          </w:tcPr>
+          <w:p>
+            <w:pPr>
+              <w:spacing w:after="0" w:before="0" w:line="240" w:lineRule="auto"/>
+              <w:jc w:val="center"/>
+              <w:rPr>
+                <w:rFonts w:ascii="Malgun Gothic" w:cs="Malgun Gothic" w:eastAsia="Malgun Gothic" w:hAnsi="Malgun Gothic"/>
+                <w:b w:val="0"/>
+                <w:bCs w:val="0"/>
+                <w:color w:val="0000ff"/>
+              </w:rPr>
+            </w:pPr>
+            <w:r>
+              <w:rPr>
+                <w:rFonts w:ascii="Malgun Gothic" w:cs="Malgun Gothic" w:eastAsia="Malgun Gothic" w:hAnsi="Malgun Gothic"/>
+                <w:b w:val="0"/>
+                <w:bCs w:val="0"/>
+                <w:color w:val="0000ff"/>
+                <w:rtl w:val="0"/>
+              </w:rPr>
+              <w:t xml:space="preserve">gpt-5.4-nano + 웹 검색으로 판정 가능 확인. 지연 p50 9.27초(5회 중 2회 20초 초과), 같은 질의 8회 중 열림 6·모름 2, 출처 URL 대조 5/5</w:t>
+            </w:r>
+          </w:p>
+        </w:tc>
+        <w:tc>
+          <w:tcPr>
+            <w:tcBorders>
+              <w:top w:color="808080" w:space="0" w:sz="7" w:val="single"/>
+              <w:left w:color="808080" w:space="0" w:sz="7" w:val="single"/>
+              <w:bottom w:color="808080" w:space="0" w:sz="7" w:val="single"/>
+              <w:right w:color="808080" w:space="0" w:sz="7" w:val="single"/>
+            </w:tcBorders>
+            <w:tcMar>
+              <w:top w:w="100.0" w:type="dxa"/>
+              <w:left w:w="100.0" w:type="dxa"/>
+              <w:bottom w:w="100.0" w:type="dxa"/>
+              <w:right w:w="100.0" w:type="dxa"/>
+            </w:tcMar>
+            <w:vAlign w:val="top"/>
+          </w:tcPr>
+          <w:p>
+            <w:pPr>
+              <w:spacing w:after="0" w:before="0" w:line="240" w:lineRule="auto"/>
+              <w:jc w:val="center"/>
+              <w:rPr>
+                <w:rFonts w:ascii="Malgun Gothic" w:cs="Malgun Gothic" w:eastAsia="Malgun Gothic" w:hAnsi="Malgun Gothic"/>
+                <w:b w:val="0"/>
+                <w:bCs w:val="0"/>
+                <w:color w:val="0000ff"/>
+              </w:rPr>
+            </w:pPr>
+            <w:r>
+              <w:rPr>
+                <w:rFonts w:ascii="Malgun Gothic" w:cs="Malgun Gothic" w:eastAsia="Malgun Gothic" w:hAnsi="Malgun Gothic"/>
+                <w:b w:val="0"/>
+                <w:bCs w:val="0"/>
+                <w:color w:val="0000ff"/>
+                <w:rtl w:val="0"/>
+              </w:rPr>
+              <w:t xml:space="preserve">스키마를 강제하면 인용(url_citation)이 오지 않음 → 출처 검증을 검색 출처 목록 대조로 변경. seed 사용 불가 → 반복 측정. 지연 때문에 섀도 판정을 고객 응답 경로에서 분리</w:t>
+            </w:r>
+          </w:p>
+        </w:tc>
+      </w:tr>
+      <w:tr>
+        <w:trPr>
+          <w:cantSplit w:val="0"/>
+          <w:trHeight w:val="566.9291338582677" w:hRule="atLeast"/>
+          <w:tblHeader w:val="0"/>
+        </w:trPr>
+        <w:tc>
+          <w:tcPr>
+            <w:tcBorders>
+              <w:top w:color="808080" w:space="0" w:sz="7" w:val="single"/>
+              <w:left w:color="808080" w:space="0" w:sz="7" w:val="single"/>
+              <w:bottom w:color="808080" w:space="0" w:sz="7" w:val="single"/>
+              <w:right w:color="808080" w:space="0" w:sz="7" w:val="single"/>
+            </w:tcBorders>
+            <w:tcMar>
+              <w:top w:w="100.0" w:type="dxa"/>
+              <w:left w:w="100.0" w:type="dxa"/>
+              <w:bottom w:w="100.0" w:type="dxa"/>
+              <w:right w:w="100.0" w:type="dxa"/>
+            </w:tcMar>
+            <w:vAlign w:val="top"/>
+          </w:tcPr>
+          <w:p>
+            <w:pPr>
+              <w:spacing w:after="0" w:before="0" w:line="240" w:lineRule="auto"/>
+              <w:jc w:val="center"/>
+              <w:rPr>
+                <w:rFonts w:ascii="Malgun Gothic" w:cs="Malgun Gothic" w:eastAsia="Malgun Gothic" w:hAnsi="Malgun Gothic"/>
+                <w:b w:val="0"/>
+                <w:bCs w:val="0"/>
+                <w:color w:val="0000ff"/>
+              </w:rPr>
+            </w:pPr>
+            <w:r>
+              <w:rPr>
+                <w:rFonts w:ascii="Malgun Gothic" w:cs="Malgun Gothic" w:eastAsia="Malgun Gothic" w:hAnsi="Malgun Gothic"/>
+                <w:b w:val="0"/>
+                <w:bCs w:val="0"/>
+                <w:color w:val="0000ff"/>
+                <w:rtl w:val="0"/>
+              </w:rPr>
+              <w:t xml:space="preserve">2026-10-06 · LLM 2단계 어댑터</w:t>
+            </w:r>
+          </w:p>
+        </w:tc>
+        <w:tc>
+          <w:tcPr>
+            <w:tcBorders>
+              <w:top w:color="808080" w:space="0" w:sz="7" w:val="single"/>
+              <w:left w:color="808080" w:space="0" w:sz="7" w:val="single"/>
+              <w:bottom w:color="808080" w:space="0" w:sz="7" w:val="single"/>
+              <w:right w:color="808080" w:space="0" w:sz="7" w:val="single"/>
+            </w:tcBorders>
+            <w:tcMar>
+              <w:top w:w="100.0" w:type="dxa"/>
+              <w:left w:w="100.0" w:type="dxa"/>
+              <w:bottom w:w="100.0" w:type="dxa"/>
+              <w:right w:w="100.0" w:type="dxa"/>
+            </w:tcMar>
+            <w:vAlign w:val="top"/>
+          </w:tcPr>
+          <w:p>
+            <w:pPr>
+              <w:spacing w:after="0" w:before="0" w:line="240" w:lineRule="auto"/>
+              <w:jc w:val="center"/>
+              <w:rPr>
+                <w:rFonts w:ascii="Malgun Gothic" w:cs="Malgun Gothic" w:eastAsia="Malgun Gothic" w:hAnsi="Malgun Gothic"/>
+                <w:b w:val="0"/>
+                <w:bCs w:val="0"/>
+                <w:color w:val="0000ff"/>
+              </w:rPr>
+            </w:pPr>
+            <w:r>
+              <w:rPr>
+                <w:rFonts w:ascii="Malgun Gothic" w:cs="Malgun Gothic" w:eastAsia="Malgun Gothic" w:hAnsi="Malgun Gothic"/>
+                <w:b w:val="0"/>
+                <w:bCs w:val="0"/>
+                <w:color w:val="0000ff"/>
+                <w:rtl w:val="0"/>
+              </w:rPr>
+              <w:t xml:space="preserve">1,917 통과 · 73 건너뜀 · 0 실패(기준선 1,896 + 새 시험 21건). 실호출 시험 1건 통과</w:t>
+            </w:r>
+          </w:p>
+        </w:tc>
+        <w:tc>
+          <w:tcPr>
+            <w:tcBorders>
+              <w:top w:color="808080" w:space="0" w:sz="7" w:val="single"/>
+              <w:left w:color="808080" w:space="0" w:sz="7" w:val="single"/>
+              <w:bottom w:color="808080" w:space="0" w:sz="7" w:val="single"/>
+              <w:right w:color="808080" w:space="0" w:sz="7" w:val="single"/>
+            </w:tcBorders>
+            <w:tcMar>
+              <w:top w:w="100.0" w:type="dxa"/>
+              <w:left w:w="100.0" w:type="dxa"/>
+              <w:bottom w:w="100.0" w:type="dxa"/>
+              <w:right w:w="100.0" w:type="dxa"/>
+            </w:tcMar>
+            <w:vAlign w:val="top"/>
+          </w:tcPr>
+          <w:p>
+            <w:pPr>
+              <w:spacing w:after="0" w:before="0" w:line="240" w:lineRule="auto"/>
+              <w:jc w:val="center"/>
+              <w:rPr>
+                <w:rFonts w:ascii="Malgun Gothic" w:cs="Malgun Gothic" w:eastAsia="Malgun Gothic" w:hAnsi="Malgun Gothic"/>
+                <w:b w:val="0"/>
+                <w:bCs w:val="0"/>
+                <w:color w:val="0000ff"/>
+              </w:rPr>
+            </w:pPr>
+            <w:r>
+              <w:rPr>
+                <w:rFonts w:ascii="Malgun Gothic" w:cs="Malgun Gothic" w:eastAsia="Malgun Gothic" w:hAnsi="Malgun Gothic"/>
+                <w:b w:val="0"/>
+                <w:bCs w:val="0"/>
+                <w:color w:val="0000ff"/>
+                <w:rtl w:val="0"/>
+              </w:rPr>
+              <w:t xml:space="preserve">고객 답변은 바뀌지 않음(어댑터만 배선)</w:t>
+            </w:r>
+          </w:p>
+        </w:tc>
+      </w:tr>
+      <w:tr>
+        <w:trPr>
+          <w:cantSplit w:val="0"/>
+          <w:trHeight w:val="566.9291338582677" w:hRule="atLeast"/>
+          <w:tblHeader w:val="0"/>
+        </w:trPr>
+        <w:tc>
+          <w:tcPr>
+            <w:tcBorders>
+              <w:top w:color="808080" w:space="0" w:sz="7" w:val="single"/>
+              <w:left w:color="808080" w:space="0" w:sz="7" w:val="single"/>
+              <w:bottom w:color="808080" w:space="0" w:sz="7" w:val="single"/>
+              <w:right w:color="808080" w:space="0" w:sz="7" w:val="single"/>
+            </w:tcBorders>
+            <w:tcMar>
+              <w:top w:w="100.0" w:type="dxa"/>
+              <w:left w:w="100.0" w:type="dxa"/>
+              <w:bottom w:w="100.0" w:type="dxa"/>
+              <w:right w:w="100.0" w:type="dxa"/>
+            </w:tcMar>
+            <w:vAlign w:val="top"/>
+          </w:tcPr>
+          <w:p>
+            <w:pPr>
+              <w:spacing w:after="0" w:before="0" w:line="240" w:lineRule="auto"/>
+              <w:jc w:val="center"/>
+              <w:rPr>
+                <w:rFonts w:ascii="Malgun Gothic" w:cs="Malgun Gothic" w:eastAsia="Malgun Gothic" w:hAnsi="Malgun Gothic"/>
+                <w:b w:val="0"/>
+                <w:bCs w:val="0"/>
+                <w:color w:val="0000ff"/>
+              </w:rPr>
+            </w:pPr>
+            <w:r>
+              <w:rPr>
+                <w:rFonts w:ascii="Malgun Gothic" w:cs="Malgun Gothic" w:eastAsia="Malgun Gothic" w:hAnsi="Malgun Gothic"/>
+                <w:b w:val="0"/>
+                <w:bCs w:val="0"/>
+                <w:color w:val="0000ff"/>
+                <w:rtl w:val="0"/>
+              </w:rPr>
+              <w:t xml:space="preserve">2026-10-06 · LLM 3단계 판정 계층</w:t>
+            </w:r>
+          </w:p>
+        </w:tc>
+        <w:tc>
+          <w:tcPr>
+            <w:tcBorders>
+              <w:top w:color="808080" w:space="0" w:sz="7" w:val="single"/>
+              <w:left w:color="808080" w:space="0" w:sz="7" w:val="single"/>
+              <w:bottom w:color="808080" w:space="0" w:sz="7" w:val="single"/>
+              <w:right w:color="808080" w:space="0" w:sz="7" w:val="single"/>
+            </w:tcBorders>
+            <w:tcMar>
+              <w:top w:w="100.0" w:type="dxa"/>
+              <w:left w:w="100.0" w:type="dxa"/>
+              <w:bottom w:w="100.0" w:type="dxa"/>
+              <w:right w:w="100.0" w:type="dxa"/>
+            </w:tcMar>
+            <w:vAlign w:val="top"/>
+          </w:tcPr>
+          <w:p>
+            <w:pPr>
+              <w:spacing w:after="0" w:before="0" w:line="240" w:lineRule="auto"/>
+              <w:jc w:val="center"/>
+              <w:rPr>
+                <w:rFonts w:ascii="Malgun Gothic" w:cs="Malgun Gothic" w:eastAsia="Malgun Gothic" w:hAnsi="Malgun Gothic"/>
+                <w:b w:val="0"/>
+                <w:bCs w:val="0"/>
+                <w:color w:val="0000ff"/>
+              </w:rPr>
+            </w:pPr>
+            <w:r>
+              <w:rPr>
+                <w:rFonts w:ascii="Malgun Gothic" w:cs="Malgun Gothic" w:eastAsia="Malgun Gothic" w:hAnsi="Malgun Gothic"/>
+                <w:b w:val="0"/>
+                <w:bCs w:val="0"/>
+                <w:color w:val="0000ff"/>
+                <w:rtl w:val="0"/>
+              </w:rPr>
+              <w:t xml:space="preserve">2,000 통과 · 73 건너뜀 · 0 실패(2단계보다 83건 증가). 실제 모델로 판정 5종 호출 확인</w:t>
+            </w:r>
+          </w:p>
+        </w:tc>
+        <w:tc>
+          <w:tcPr>
+            <w:tcBorders>
+              <w:top w:color="808080" w:space="0" w:sz="7" w:val="single"/>
+              <w:left w:color="808080" w:space="0" w:sz="7" w:val="single"/>
+              <w:bottom w:color="808080" w:space="0" w:sz="7" w:val="single"/>
+              <w:right w:color="808080" w:space="0" w:sz="7" w:val="single"/>
+            </w:tcBorders>
+            <w:tcMar>
+              <w:top w:w="100.0" w:type="dxa"/>
+              <w:left w:w="100.0" w:type="dxa"/>
+              <w:bottom w:w="100.0" w:type="dxa"/>
+              <w:right w:w="100.0" w:type="dxa"/>
+            </w:tcMar>
+            <w:vAlign w:val="top"/>
+          </w:tcPr>
+          <w:p>
+            <w:pPr>
+              <w:spacing w:after="0" w:before="0" w:line="240" w:lineRule="auto"/>
+              <w:jc w:val="center"/>
+              <w:rPr>
+                <w:rFonts w:ascii="Malgun Gothic" w:cs="Malgun Gothic" w:eastAsia="Malgun Gothic" w:hAnsi="Malgun Gothic"/>
+                <w:b w:val="0"/>
+                <w:bCs w:val="0"/>
+                <w:color w:val="0000ff"/>
+              </w:rPr>
+            </w:pPr>
+            <w:r>
+              <w:rPr>
+                <w:rFonts w:ascii="Malgun Gothic" w:cs="Malgun Gothic" w:eastAsia="Malgun Gothic" w:hAnsi="Malgun Gothic"/>
+                <w:b w:val="0"/>
+                <w:bCs w:val="0"/>
+                <w:color w:val="0000ff"/>
+                <w:rtl w:val="0"/>
+              </w:rPr>
+              <w:t xml:space="preserve">인용이 원문에 없거나 출처가 검색 목록에 없으면 「모름」으로 내림. 호출 실패는 예외 대신 「모름」+실패 코드. 게시일 없는 근거는 버리지 않고 셈</w:t>
+            </w:r>
+          </w:p>
+        </w:tc>
+      </w:tr>
+      <w:tr>
+        <w:trPr>
+          <w:cantSplit w:val="0"/>
+          <w:trHeight w:val="566.9291338582677" w:hRule="atLeast"/>
+          <w:tblHeader w:val="0"/>
+        </w:trPr>
+        <w:tc>
+          <w:tcPr>
+            <w:tcBorders>
+              <w:top w:color="808080" w:space="0" w:sz="7" w:val="single"/>
+              <w:left w:color="808080" w:space="0" w:sz="7" w:val="single"/>
+              <w:bottom w:color="808080" w:space="0" w:sz="7" w:val="single"/>
+              <w:right w:color="808080" w:space="0" w:sz="7" w:val="single"/>
+            </w:tcBorders>
+            <w:tcMar>
+              <w:top w:w="100.0" w:type="dxa"/>
+              <w:left w:w="100.0" w:type="dxa"/>
+              <w:bottom w:w="100.0" w:type="dxa"/>
+              <w:right w:w="100.0" w:type="dxa"/>
+            </w:tcMar>
+            <w:vAlign w:val="top"/>
+          </w:tcPr>
+          <w:p>
+            <w:pPr>
+              <w:spacing w:after="0" w:before="0" w:line="240" w:lineRule="auto"/>
+              <w:jc w:val="center"/>
+              <w:rPr>
+                <w:rFonts w:ascii="Malgun Gothic" w:cs="Malgun Gothic" w:eastAsia="Malgun Gothic" w:hAnsi="Malgun Gothic"/>
+                <w:b w:val="0"/>
+                <w:bCs w:val="0"/>
+                <w:color w:val="0000ff"/>
+              </w:rPr>
+            </w:pPr>
+            <w:r>
+              <w:rPr>
+                <w:rFonts w:ascii="Malgun Gothic" w:cs="Malgun Gothic" w:eastAsia="Malgun Gothic" w:hAnsi="Malgun Gothic"/>
+                <w:b w:val="0"/>
+                <w:bCs w:val="0"/>
+                <w:color w:val="0000ff"/>
+                <w:rtl w:val="0"/>
+              </w:rPr>
+              <w:t xml:space="preserve">2026-10-06 · LLM 4단계 판정 연결</w:t>
+            </w:r>
+          </w:p>
+        </w:tc>
+        <w:tc>
+          <w:tcPr>
+            <w:tcBorders>
+              <w:top w:color="808080" w:space="0" w:sz="7" w:val="single"/>
+              <w:left w:color="808080" w:space="0" w:sz="7" w:val="single"/>
+              <w:bottom w:color="808080" w:space="0" w:sz="7" w:val="single"/>
+              <w:right w:color="808080" w:space="0" w:sz="7" w:val="single"/>
+            </w:tcBorders>
+            <w:tcMar>
+              <w:top w:w="100.0" w:type="dxa"/>
+              <w:left w:w="100.0" w:type="dxa"/>
+              <w:bottom w:w="100.0" w:type="dxa"/>
+              <w:right w:w="100.0" w:type="dxa"/>
+            </w:tcMar>
+            <w:vAlign w:val="top"/>
+          </w:tcPr>
+          <w:p>
+            <w:pPr>
+              <w:spacing w:after="0" w:before="0" w:line="240" w:lineRule="auto"/>
+              <w:jc w:val="center"/>
+              <w:rPr>
+                <w:rFonts w:ascii="Malgun Gothic" w:cs="Malgun Gothic" w:eastAsia="Malgun Gothic" w:hAnsi="Malgun Gothic"/>
+                <w:b w:val="0"/>
+                <w:bCs w:val="0"/>
+                <w:color w:val="0000ff"/>
+              </w:rPr>
+            </w:pPr>
+            <w:r>
+              <w:rPr>
+                <w:rFonts w:ascii="Malgun Gothic" w:cs="Malgun Gothic" w:eastAsia="Malgun Gothic" w:hAnsi="Malgun Gothic"/>
+                <w:b w:val="0"/>
+                <w:bCs w:val="0"/>
+                <w:color w:val="0000ff"/>
+                <w:rtl w:val="0"/>
+              </w:rPr>
+              <w:t xml:space="preserve">2,016 통과. 기존 여행 시험 1,370건 그대로 통과. 섀도 모드에서 고객 결과가 규칙 모드와 동일. 실호출: 고객 답변 0.01초, 백그라운드 판정 5건 11초 뒤 완료</w:t>
+            </w:r>
+          </w:p>
+        </w:tc>
+        <w:tc>
+          <w:tcPr>
+            <w:tcBorders>
+              <w:top w:color="808080" w:space="0" w:sz="7" w:val="single"/>
+              <w:left w:color="808080" w:space="0" w:sz="7" w:val="single"/>
+              <w:bottom w:color="808080" w:space="0" w:sz="7" w:val="single"/>
+              <w:right w:color="808080" w:space="0" w:sz="7" w:val="single"/>
+            </w:tcBorders>
+            <w:tcMar>
+              <w:top w:w="100.0" w:type="dxa"/>
+              <w:left w:w="100.0" w:type="dxa"/>
+              <w:bottom w:w="100.0" w:type="dxa"/>
+              <w:right w:w="100.0" w:type="dxa"/>
+            </w:tcMar>
+            <w:vAlign w:val="top"/>
+          </w:tcPr>
+          <w:p>
+            <w:pPr>
+              <w:spacing w:after="0" w:before="0" w:line="240" w:lineRule="auto"/>
+              <w:jc w:val="center"/>
+              <w:rPr>
+                <w:rFonts w:ascii="Malgun Gothic" w:cs="Malgun Gothic" w:eastAsia="Malgun Gothic" w:hAnsi="Malgun Gothic"/>
+                <w:b w:val="0"/>
+                <w:bCs w:val="0"/>
+                <w:color w:val="0000ff"/>
+              </w:rPr>
+            </w:pPr>
+            <w:r>
+              <w:rPr>
+                <w:rFonts w:ascii="Malgun Gothic" w:cs="Malgun Gothic" w:eastAsia="Malgun Gothic" w:hAnsi="Malgun Gothic"/>
+                <w:b w:val="0"/>
+                <w:bCs w:val="0"/>
+                <w:color w:val="0000ff"/>
+                <w:rtl w:val="0"/>
+              </w:rPr>
+              <w:t xml:space="preserve">실호출 첫 회에 판정 5건이 모두 llm_error(시험용 run_id 가 감사 기록 외래 키에 걸림, 운영 경로는 해당 없음) → 예외 종류를 로그에 남기도록 수정. 통합 시험 8건 실패는 RAG 임베딩 미적재로 무관</w:t>
+            </w:r>
+          </w:p>
+        </w:tc>
+      </w:tr>
+      <w:tr>
+        <w:trPr>
+          <w:cantSplit w:val="0"/>
+          <w:trHeight w:val="566.9291338582677" w:hRule="atLeast"/>
+          <w:tblHeader w:val="0"/>
+        </w:trPr>
+        <w:tc>
+          <w:tcPr>
+            <w:tcBorders>
+              <w:top w:color="808080" w:space="0" w:sz="7" w:val="single"/>
+              <w:left w:color="808080" w:space="0" w:sz="7" w:val="single"/>
+              <w:bottom w:color="808080" w:space="0" w:sz="7" w:val="single"/>
+              <w:right w:color="808080" w:space="0" w:sz="7" w:val="single"/>
+            </w:tcBorders>
+            <w:tcMar>
+              <w:top w:w="100.0" w:type="dxa"/>
+              <w:left w:w="100.0" w:type="dxa"/>
+              <w:bottom w:w="100.0" w:type="dxa"/>
+              <w:right w:w="100.0" w:type="dxa"/>
+            </w:tcMar>
+            <w:vAlign w:val="top"/>
+          </w:tcPr>
+          <w:p>
+            <w:pPr>
+              <w:spacing w:after="0" w:before="0" w:line="240" w:lineRule="auto"/>
+              <w:jc w:val="center"/>
+              <w:rPr>
+                <w:rFonts w:ascii="Malgun Gothic" w:cs="Malgun Gothic" w:eastAsia="Malgun Gothic" w:hAnsi="Malgun Gothic"/>
+                <w:b w:val="0"/>
+                <w:bCs w:val="0"/>
+                <w:color w:val="0000ff"/>
+              </w:rPr>
+            </w:pPr>
+            <w:r>
+              <w:rPr>
+                <w:rFonts w:ascii="Malgun Gothic" w:cs="Malgun Gothic" w:eastAsia="Malgun Gothic" w:hAnsi="Malgun Gothic"/>
+                <w:b w:val="0"/>
+                <w:bCs w:val="0"/>
+                <w:color w:val="0000ff"/>
+                <w:rtl w:val="0"/>
+              </w:rPr>
+              <w:t xml:space="preserve">2026-10-06 · 섀도 기록 표</w:t>
+            </w:r>
+          </w:p>
+        </w:tc>
+        <w:tc>
+          <w:tcPr>
+            <w:tcBorders>
+              <w:top w:color="808080" w:space="0" w:sz="7" w:val="single"/>
+              <w:left w:color="808080" w:space="0" w:sz="7" w:val="single"/>
+              <w:bottom w:color="808080" w:space="0" w:sz="7" w:val="single"/>
+              <w:right w:color="808080" w:space="0" w:sz="7" w:val="single"/>
+            </w:tcBorders>
+            <w:tcMar>
+              <w:top w:w="100.0" w:type="dxa"/>
+              <w:left w:w="100.0" w:type="dxa"/>
+              <w:bottom w:w="100.0" w:type="dxa"/>
+              <w:right w:w="100.0" w:type="dxa"/>
+            </w:tcMar>
+            <w:vAlign w:val="top"/>
+          </w:tcPr>
+          <w:p>
+            <w:pPr>
+              <w:spacing w:after="0" w:before="0" w:line="240" w:lineRule="auto"/>
+              <w:jc w:val="center"/>
+              <w:rPr>
+                <w:rFonts w:ascii="Malgun Gothic" w:cs="Malgun Gothic" w:eastAsia="Malgun Gothic" w:hAnsi="Malgun Gothic"/>
+                <w:b w:val="0"/>
+                <w:bCs w:val="0"/>
+                <w:color w:val="0000ff"/>
+              </w:rPr>
+            </w:pPr>
+            <w:r>
+              <w:rPr>
+                <w:rFonts w:ascii="Malgun Gothic" w:cs="Malgun Gothic" w:eastAsia="Malgun Gothic" w:hAnsi="Malgun Gothic"/>
+                <w:b w:val="0"/>
+                <w:bCs w:val="0"/>
+                <w:color w:val="0000ff"/>
+                <w:rtl w:val="0"/>
+              </w:rPr>
+              <w:t xml:space="preserve">실제 모델로 섀도 실행 1회 → 표에 5행 적재 확인, 종류별 일치율을 SQL 한 줄로 집계. DB 통합 시험 4건</w:t>
+            </w:r>
+          </w:p>
+        </w:tc>
+        <w:tc>
+          <w:tcPr>
+            <w:tcBorders>
+              <w:top w:color="808080" w:space="0" w:sz="7" w:val="single"/>
+              <w:left w:color="808080" w:space="0" w:sz="7" w:val="single"/>
+              <w:bottom w:color="808080" w:space="0" w:sz="7" w:val="single"/>
+              <w:right w:color="808080" w:space="0" w:sz="7" w:val="single"/>
+            </w:tcBorders>
+            <w:tcMar>
+              <w:top w:w="100.0" w:type="dxa"/>
+              <w:left w:w="100.0" w:type="dxa"/>
+              <w:bottom w:w="100.0" w:type="dxa"/>
+              <w:right w:w="100.0" w:type="dxa"/>
+            </w:tcMar>
+            <w:vAlign w:val="top"/>
+          </w:tcPr>
+          <w:p>
+            <w:pPr>
+              <w:spacing w:after="0" w:before="0" w:line="240" w:lineRule="auto"/>
+              <w:jc w:val="center"/>
+              <w:rPr>
+                <w:rFonts w:ascii="Malgun Gothic" w:cs="Malgun Gothic" w:eastAsia="Malgun Gothic" w:hAnsi="Malgun Gothic"/>
+                <w:b w:val="0"/>
+                <w:bCs w:val="0"/>
+                <w:color w:val="0000ff"/>
+              </w:rPr>
+            </w:pPr>
+            <w:r>
+              <w:rPr>
+                <w:rFonts w:ascii="Malgun Gothic" w:cs="Malgun Gothic" w:eastAsia="Malgun Gothic" w:hAnsi="Malgun Gothic"/>
+                <w:b w:val="0"/>
+                <w:bCs w:val="0"/>
+                <w:color w:val="0000ff"/>
+                <w:rtl w:val="0"/>
+              </w:rPr>
+              <w:t xml:space="preserve">로그로만 남기던 섀도 기록이 운영에서 아무 데도 남지 않던 문제 → DB 표로 이동</w:t>
+            </w:r>
+          </w:p>
+        </w:tc>
+      </w:tr>
+      <w:tr>
+        <w:trPr>
+          <w:cantSplit w:val="0"/>
+          <w:trHeight w:val="566.9291338582677" w:hRule="atLeast"/>
+          <w:tblHeader w:val="0"/>
+        </w:trPr>
+        <w:tc>
+          <w:tcPr>
+            <w:tcBorders>
+              <w:top w:color="808080" w:space="0" w:sz="7" w:val="single"/>
+              <w:left w:color="808080" w:space="0" w:sz="7" w:val="single"/>
+              <w:bottom w:color="808080" w:space="0" w:sz="7" w:val="single"/>
+              <w:right w:color="808080" w:space="0" w:sz="7" w:val="single"/>
+            </w:tcBorders>
+            <w:tcMar>
+              <w:top w:w="100.0" w:type="dxa"/>
+              <w:left w:w="100.0" w:type="dxa"/>
+              <w:bottom w:w="100.0" w:type="dxa"/>
+              <w:right w:w="100.0" w:type="dxa"/>
+            </w:tcMar>
+            <w:vAlign w:val="top"/>
+          </w:tcPr>
+          <w:p>
+            <w:pPr>
+              <w:spacing w:after="0" w:before="0" w:line="240" w:lineRule="auto"/>
+              <w:jc w:val="center"/>
+              <w:rPr>
+                <w:rFonts w:ascii="Malgun Gothic" w:cs="Malgun Gothic" w:eastAsia="Malgun Gothic" w:hAnsi="Malgun Gothic"/>
+                <w:b w:val="0"/>
+                <w:bCs w:val="0"/>
+                <w:color w:val="0000ff"/>
+              </w:rPr>
+            </w:pPr>
+            <w:r>
+              <w:rPr>
+                <w:rFonts w:ascii="Malgun Gothic" w:cs="Malgun Gothic" w:eastAsia="Malgun Gothic" w:hAnsi="Malgun Gothic"/>
+                <w:b w:val="0"/>
+                <w:bCs w:val="0"/>
+                <w:color w:val="0000ff"/>
+                <w:rtl w:val="0"/>
+              </w:rPr>
+              <w:t xml:space="preserve">2026-10-06 · LLM 5단계 골든셋 평가(사람 검토 전)</w:t>
+            </w:r>
+          </w:p>
+        </w:tc>
+        <w:tc>
+          <w:tcPr>
+            <w:tcBorders>
+              <w:top w:color="808080" w:space="0" w:sz="7" w:val="single"/>
+              <w:left w:color="808080" w:space="0" w:sz="7" w:val="single"/>
+              <w:bottom w:color="808080" w:space="0" w:sz="7" w:val="single"/>
+              <w:right w:color="808080" w:space="0" w:sz="7" w:val="single"/>
+            </w:tcBorders>
+            <w:tcMar>
+              <w:top w:w="100.0" w:type="dxa"/>
+              <w:left w:w="100.0" w:type="dxa"/>
+              <w:bottom w:w="100.0" w:type="dxa"/>
+              <w:right w:w="100.0" w:type="dxa"/>
+            </w:tcMar>
+            <w:vAlign w:val="top"/>
+          </w:tcPr>
+          <w:p>
+            <w:pPr>
+              <w:spacing w:after="0" w:before="0" w:line="240" w:lineRule="auto"/>
+              <w:jc w:val="center"/>
+              <w:rPr>
+                <w:rFonts w:ascii="Malgun Gothic" w:cs="Malgun Gothic" w:eastAsia="Malgun Gothic" w:hAnsi="Malgun Gothic"/>
+                <w:b w:val="0"/>
+                <w:bCs w:val="0"/>
+                <w:color w:val="0000ff"/>
+              </w:rPr>
+            </w:pPr>
+            <w:r>
+              <w:rPr>
+                <w:rFonts w:ascii="Malgun Gothic" w:cs="Malgun Gothic" w:eastAsia="Malgun Gothic" w:hAnsi="Malgun Gothic"/>
+                <w:b w:val="0"/>
+                <w:bCs w:val="0"/>
+                <w:color w:val="0000ff"/>
+                <w:rtl w:val="0"/>
+              </w:rPr>
+              <w:t xml:space="preserve">LLM 0.987(154/156 관측) vs 규칙 0.462(24/52 항목), 차이 +0.526. 위험한 오답 LLM 2/156 · 규칙 13/52. 웹 판정은 호출 성공 16/24(429 8건), 회차 일관성 3/8</w:t>
+            </w:r>
+          </w:p>
+        </w:tc>
+        <w:tc>
+          <w:tcPr>
+            <w:tcBorders>
+              <w:top w:color="808080" w:space="0" w:sz="7" w:val="single"/>
+              <w:left w:color="808080" w:space="0" w:sz="7" w:val="single"/>
+              <w:bottom w:color="808080" w:space="0" w:sz="7" w:val="single"/>
+              <w:right w:color="808080" w:space="0" w:sz="7" w:val="single"/>
+            </w:tcBorders>
+            <w:tcMar>
+              <w:top w:w="100.0" w:type="dxa"/>
+              <w:left w:w="100.0" w:type="dxa"/>
+              <w:bottom w:w="100.0" w:type="dxa"/>
+              <w:right w:w="100.0" w:type="dxa"/>
+            </w:tcMar>
+            <w:vAlign w:val="top"/>
+          </w:tcPr>
+          <w:p>
+            <w:pPr>
+              <w:spacing w:after="0" w:before="0" w:line="240" w:lineRule="auto"/>
+              <w:jc w:val="center"/>
+              <w:rPr>
+                <w:rFonts w:ascii="Malgun Gothic" w:cs="Malgun Gothic" w:eastAsia="Malgun Gothic" w:hAnsi="Malgun Gothic"/>
+                <w:b w:val="0"/>
+                <w:bCs w:val="0"/>
+                <w:color w:val="0000ff"/>
+              </w:rPr>
+            </w:pPr>
+            <w:r>
+              <w:rPr>
+                <w:rFonts w:ascii="Malgun Gothic" w:cs="Malgun Gothic" w:eastAsia="Malgun Gothic" w:hAnsi="Malgun Gothic"/>
+                <w:b w:val="0"/>
+                <w:bCs w:val="0"/>
+                <w:color w:val="0000ff"/>
+                <w:rtl w:val="0"/>
+              </w:rPr>
+              <w:t xml:space="preserve">라벨을 작성자가 달았고 사람 검토 전이라 낙관일 수 있음(이후 10-12 사람 검토로 재측정). 정기휴무 정규식이 「매주 X」 원문 309건 중 307건을 놓침 → 다음 항목에서 수정</w:t>
+            </w:r>
+          </w:p>
+        </w:tc>
+      </w:tr>
+      <w:tr>
+        <w:trPr>
+          <w:cantSplit w:val="0"/>
+          <w:trHeight w:val="566.9291338582677" w:hRule="atLeast"/>
+          <w:tblHeader w:val="0"/>
+        </w:trPr>
+        <w:tc>
+          <w:tcPr>
+            <w:tcBorders>
+              <w:top w:color="808080" w:space="0" w:sz="7" w:val="single"/>
+              <w:left w:color="808080" w:space="0" w:sz="7" w:val="single"/>
+              <w:bottom w:color="808080" w:space="0" w:sz="7" w:val="single"/>
+              <w:right w:color="808080" w:space="0" w:sz="7" w:val="single"/>
+            </w:tcBorders>
+            <w:tcMar>
+              <w:top w:w="100.0" w:type="dxa"/>
+              <w:left w:w="100.0" w:type="dxa"/>
+              <w:bottom w:w="100.0" w:type="dxa"/>
+              <w:right w:w="100.0" w:type="dxa"/>
+            </w:tcMar>
+            <w:vAlign w:val="top"/>
+          </w:tcPr>
+          <w:p>
+            <w:pPr>
+              <w:spacing w:after="0" w:before="0" w:line="240" w:lineRule="auto"/>
+              <w:jc w:val="center"/>
+              <w:rPr>
+                <w:rFonts w:ascii="Malgun Gothic" w:cs="Malgun Gothic" w:eastAsia="Malgun Gothic" w:hAnsi="Malgun Gothic"/>
+                <w:b w:val="0"/>
+                <w:bCs w:val="0"/>
+                <w:color w:val="0000ff"/>
+              </w:rPr>
+            </w:pPr>
+            <w:r>
+              <w:rPr>
+                <w:rFonts w:ascii="Malgun Gothic" w:cs="Malgun Gothic" w:eastAsia="Malgun Gothic" w:hAnsi="Malgun Gothic"/>
+                <w:b w:val="0"/>
+                <w:bCs w:val="0"/>
+                <w:color w:val="0000ff"/>
+                <w:rtl w:val="0"/>
+              </w:rPr>
+              <w:t xml:space="preserve">2026-10-06 · 정기휴무 규칙 수정</w:t>
+            </w:r>
+          </w:p>
+        </w:tc>
+        <w:tc>
+          <w:tcPr>
+            <w:tcBorders>
+              <w:top w:color="808080" w:space="0" w:sz="7" w:val="single"/>
+              <w:left w:color="808080" w:space="0" w:sz="7" w:val="single"/>
+              <w:bottom w:color="808080" w:space="0" w:sz="7" w:val="single"/>
+              <w:right w:color="808080" w:space="0" w:sz="7" w:val="single"/>
+            </w:tcBorders>
+            <w:tcMar>
+              <w:top w:w="100.0" w:type="dxa"/>
+              <w:left w:w="100.0" w:type="dxa"/>
+              <w:bottom w:w="100.0" w:type="dxa"/>
+              <w:right w:w="100.0" w:type="dxa"/>
+            </w:tcMar>
+            <w:vAlign w:val="top"/>
+          </w:tcPr>
+          <w:p>
+            <w:pPr>
+              <w:spacing w:after="0" w:before="0" w:line="240" w:lineRule="auto"/>
+              <w:jc w:val="center"/>
+              <w:rPr>
+                <w:rFonts w:ascii="Malgun Gothic" w:cs="Malgun Gothic" w:eastAsia="Malgun Gothic" w:hAnsi="Malgun Gothic"/>
+                <w:b w:val="0"/>
+                <w:bCs w:val="0"/>
+                <w:color w:val="0000ff"/>
+              </w:rPr>
+            </w:pPr>
+            <w:r>
+              <w:rPr>
+                <w:rFonts w:ascii="Malgun Gothic" w:cs="Malgun Gothic" w:eastAsia="Malgun Gothic" w:hAnsi="Malgun Gothic"/>
+                <w:b w:val="0"/>
+                <w:bCs w:val="0"/>
+                <w:color w:val="0000ff"/>
+                <w:rtl w:val="0"/>
+              </w:rPr>
+              <w:t xml:space="preserve">「매주 X」 원문 놓침 307건 → 0건. 새 시험 34건(재발 방지·규칙·성립 판정 연결)</w:t>
+            </w:r>
+          </w:p>
+        </w:tc>
+        <w:tc>
+          <w:tcPr>
+            <w:tcBorders>
+              <w:top w:color="808080" w:space="0" w:sz="7" w:val="single"/>
+              <w:left w:color="808080" w:space="0" w:sz="7" w:val="single"/>
+              <w:bottom w:color="808080" w:space="0" w:sz="7" w:val="single"/>
+              <w:right w:color="808080" w:space="0" w:sz="7" w:val="single"/>
+            </w:tcBorders>
+            <w:tcMar>
+              <w:top w:w="100.0" w:type="dxa"/>
+              <w:left w:w="100.0" w:type="dxa"/>
+              <w:bottom w:w="100.0" w:type="dxa"/>
+              <w:right w:w="100.0" w:type="dxa"/>
+            </w:tcMar>
+            <w:vAlign w:val="top"/>
+          </w:tcPr>
+          <w:p>
+            <w:pPr>
+              <w:spacing w:after="0" w:before="0" w:line="240" w:lineRule="auto"/>
+              <w:jc w:val="center"/>
+              <w:rPr>
+                <w:rFonts w:ascii="Malgun Gothic" w:cs="Malgun Gothic" w:eastAsia="Malgun Gothic" w:hAnsi="Malgun Gothic"/>
+                <w:b w:val="0"/>
+                <w:bCs w:val="0"/>
+                <w:color w:val="0000ff"/>
+              </w:rPr>
+            </w:pPr>
+            <w:r>
+              <w:rPr>
+                <w:rFonts w:ascii="Malgun Gothic" w:cs="Malgun Gothic" w:eastAsia="Malgun Gothic" w:hAnsi="Malgun Gothic"/>
+                <w:b w:val="0"/>
+                <w:bCs w:val="0"/>
+                <w:color w:val="0000ff"/>
+                <w:rtl w:val="0"/>
+              </w:rPr>
+              <w:t xml:space="preserve">휴무를 한국 날짜 기준으로 판정(전에는 UTC 요일로 하루 어긋남). 공휴일 조회 키가 서비스에 미등록(HTTP 403)이라 공휴일 조건은 당분간 「모름」</w:t>
+            </w:r>
+          </w:p>
+        </w:tc>
+      </w:tr>
+      <w:tr>
+        <w:trPr>
+          <w:cantSplit w:val="0"/>
+          <w:trHeight w:val="566.9291338582677" w:hRule="atLeast"/>
+          <w:tblHeader w:val="0"/>
+        </w:trPr>
+        <w:tc>
+          <w:tcPr>
+            <w:tcBorders>
+              <w:top w:color="808080" w:space="0" w:sz="7" w:val="single"/>
+              <w:left w:color="808080" w:space="0" w:sz="7" w:val="single"/>
+              <w:bottom w:color="808080" w:space="0" w:sz="7" w:val="single"/>
+              <w:right w:color="808080" w:space="0" w:sz="7" w:val="single"/>
+            </w:tcBorders>
+            <w:tcMar>
+              <w:top w:w="100.0" w:type="dxa"/>
+              <w:left w:w="100.0" w:type="dxa"/>
+              <w:bottom w:w="100.0" w:type="dxa"/>
+              <w:right w:w="100.0" w:type="dxa"/>
+            </w:tcMar>
+            <w:vAlign w:val="top"/>
+          </w:tcPr>
+          <w:p>
+            <w:pPr>
+              <w:spacing w:after="0" w:before="0" w:line="240" w:lineRule="auto"/>
+              <w:jc w:val="center"/>
+              <w:rPr>
+                <w:rFonts w:ascii="Malgun Gothic" w:cs="Malgun Gothic" w:eastAsia="Malgun Gothic" w:hAnsi="Malgun Gothic"/>
+                <w:b w:val="0"/>
+                <w:bCs w:val="0"/>
+                <w:color w:val="0000ff"/>
+              </w:rPr>
+            </w:pPr>
+            <w:r>
+              <w:rPr>
+                <w:rFonts w:ascii="Malgun Gothic" w:cs="Malgun Gothic" w:eastAsia="Malgun Gothic" w:hAnsi="Malgun Gothic"/>
+                <w:b w:val="0"/>
+                <w:bCs w:val="0"/>
+                <w:color w:val="0000ff"/>
+                <w:rtl w:val="0"/>
+              </w:rPr>
+              <w:t xml:space="preserve">2026-10-11 · 작업 B: 라벨 검토 도구·결과 상태 계약·재난 분류표</w:t>
+            </w:r>
+          </w:p>
+        </w:tc>
+        <w:tc>
+          <w:tcPr>
+            <w:tcBorders>
+              <w:top w:color="808080" w:space="0" w:sz="7" w:val="single"/>
+              <w:left w:color="808080" w:space="0" w:sz="7" w:val="single"/>
+              <w:bottom w:color="808080" w:space="0" w:sz="7" w:val="single"/>
+              <w:right w:color="808080" w:space="0" w:sz="7" w:val="single"/>
+            </w:tcBorders>
+            <w:tcMar>
+              <w:top w:w="100.0" w:type="dxa"/>
+              <w:left w:w="100.0" w:type="dxa"/>
+              <w:bottom w:w="100.0" w:type="dxa"/>
+              <w:right w:w="100.0" w:type="dxa"/>
+            </w:tcMar>
+            <w:vAlign w:val="top"/>
+          </w:tcPr>
+          <w:p>
+            <w:pPr>
+              <w:spacing w:after="0" w:before="0" w:line="240" w:lineRule="auto"/>
+              <w:jc w:val="center"/>
+              <w:rPr>
+                <w:rFonts w:ascii="Malgun Gothic" w:cs="Malgun Gothic" w:eastAsia="Malgun Gothic" w:hAnsi="Malgun Gothic"/>
+                <w:b w:val="0"/>
+                <w:bCs w:val="0"/>
+                <w:color w:val="0000ff"/>
+              </w:rPr>
+            </w:pPr>
+            <w:r>
+              <w:rPr>
+                <w:rFonts w:ascii="Malgun Gothic" w:cs="Malgun Gothic" w:eastAsia="Malgun Gothic" w:hAnsi="Malgun Gothic"/>
+                <w:b w:val="0"/>
+                <w:bCs w:val="0"/>
+                <w:color w:val="0000ff"/>
+                <w:rtl w:val="0"/>
+              </w:rPr>
+              <w:t xml:space="preserve">활동·증거 단위 322 통과, 평가 단위 70 통과, 가드레일 계약 6 · 구조 2 통과. 통합(DB)·e2e·live·전체 시험은 돌리지 못했다고 명시</w:t>
+            </w:r>
+          </w:p>
+        </w:tc>
+        <w:tc>
+          <w:tcPr>
+            <w:tcBorders>
+              <w:top w:color="808080" w:space="0" w:sz="7" w:val="single"/>
+              <w:left w:color="808080" w:space="0" w:sz="7" w:val="single"/>
+              <w:bottom w:color="808080" w:space="0" w:sz="7" w:val="single"/>
+              <w:right w:color="808080" w:space="0" w:sz="7" w:val="single"/>
+            </w:tcBorders>
+            <w:tcMar>
+              <w:top w:w="100.0" w:type="dxa"/>
+              <w:left w:w="100.0" w:type="dxa"/>
+              <w:bottom w:w="100.0" w:type="dxa"/>
+              <w:right w:w="100.0" w:type="dxa"/>
+            </w:tcMar>
+            <w:vAlign w:val="top"/>
+          </w:tcPr>
+          <w:p>
+            <w:pPr>
+              <w:spacing w:after="0" w:before="0" w:line="240" w:lineRule="auto"/>
+              <w:jc w:val="center"/>
+              <w:rPr>
+                <w:rFonts w:ascii="Malgun Gothic" w:cs="Malgun Gothic" w:eastAsia="Malgun Gothic" w:hAnsi="Malgun Gothic"/>
+                <w:b w:val="0"/>
+                <w:bCs w:val="0"/>
+                <w:color w:val="0000ff"/>
+              </w:rPr>
+            </w:pPr>
+            <w:r>
+              <w:rPr>
+                <w:rFonts w:ascii="Malgun Gothic" w:cs="Malgun Gothic" w:eastAsia="Malgun Gothic" w:hAnsi="Malgun Gothic"/>
+                <w:b w:val="0"/>
+                <w:bCs w:val="0"/>
+                <w:color w:val="0000ff"/>
+                <w:rtl w:val="0"/>
+              </w:rPr>
+              <w:t xml:space="preserve">도구 선언에 read.disaster_points 가 빠져 재난으로 막힌 뒤 대체 후보를 찾으면 죽었을 결함 발견·수정. 판정 규칙이 코어 포트를 직접 import 하는 구조 시험 1건은 변경 전부터 실패(이후 우회로 해소)</w:t>
+            </w:r>
+          </w:p>
+        </w:tc>
+      </w:tr>
+      <w:tr>
+        <w:trPr>
+          <w:cantSplit w:val="0"/>
+          <w:trHeight w:val="566.9291338582677" w:hRule="atLeast"/>
+          <w:tblHeader w:val="0"/>
+        </w:trPr>
+        <w:tc>
+          <w:tcPr>
+            <w:tcBorders>
+              <w:top w:color="808080" w:space="0" w:sz="7" w:val="single"/>
+              <w:left w:color="808080" w:space="0" w:sz="7" w:val="single"/>
+              <w:bottom w:color="808080" w:space="0" w:sz="7" w:val="single"/>
+              <w:right w:color="808080" w:space="0" w:sz="7" w:val="single"/>
+            </w:tcBorders>
+            <w:tcMar>
+              <w:top w:w="100.0" w:type="dxa"/>
+              <w:left w:w="100.0" w:type="dxa"/>
+              <w:bottom w:w="100.0" w:type="dxa"/>
+              <w:right w:w="100.0" w:type="dxa"/>
+            </w:tcMar>
+            <w:vAlign w:val="top"/>
+          </w:tcPr>
+          <w:p>
+            <w:pPr>
+              <w:spacing w:after="0" w:before="0" w:line="240" w:lineRule="auto"/>
+              <w:jc w:val="center"/>
+              <w:rPr>
+                <w:rFonts w:ascii="Malgun Gothic" w:cs="Malgun Gothic" w:eastAsia="Malgun Gothic" w:hAnsi="Malgun Gothic"/>
+                <w:b w:val="0"/>
+                <w:bCs w:val="0"/>
+                <w:color w:val="0000ff"/>
+              </w:rPr>
+            </w:pPr>
+            <w:r>
+              <w:rPr>
+                <w:rFonts w:ascii="Malgun Gothic" w:cs="Malgun Gothic" w:eastAsia="Malgun Gothic" w:hAnsi="Malgun Gothic"/>
+                <w:b w:val="0"/>
+                <w:bCs w:val="0"/>
+                <w:color w:val="0000ff"/>
+                <w:rtl w:val="0"/>
+              </w:rPr>
+              <w:t xml:space="preserve">2026-10-11~14 · CSV 컬럼 정리·TourAPI 보강</w:t>
+            </w:r>
+          </w:p>
+        </w:tc>
+        <w:tc>
+          <w:tcPr>
+            <w:tcBorders>
+              <w:top w:color="808080" w:space="0" w:sz="7" w:val="single"/>
+              <w:left w:color="808080" w:space="0" w:sz="7" w:val="single"/>
+              <w:bottom w:color="808080" w:space="0" w:sz="7" w:val="single"/>
+              <w:right w:color="808080" w:space="0" w:sz="7" w:val="single"/>
+            </w:tcBorders>
+            <w:tcMar>
+              <w:top w:w="100.0" w:type="dxa"/>
+              <w:left w:w="100.0" w:type="dxa"/>
+              <w:bottom w:w="100.0" w:type="dxa"/>
+              <w:right w:w="100.0" w:type="dxa"/>
+            </w:tcMar>
+            <w:vAlign w:val="top"/>
+          </w:tcPr>
+          <w:p>
+            <w:pPr>
+              <w:spacing w:after="0" w:before="0" w:line="240" w:lineRule="auto"/>
+              <w:jc w:val="center"/>
+              <w:rPr>
+                <w:rFonts w:ascii="Malgun Gothic" w:cs="Malgun Gothic" w:eastAsia="Malgun Gothic" w:hAnsi="Malgun Gothic"/>
+                <w:b w:val="0"/>
+                <w:bCs w:val="0"/>
+                <w:color w:val="0000ff"/>
+              </w:rPr>
+            </w:pPr>
+            <w:r>
+              <w:rPr>
+                <w:rFonts w:ascii="Malgun Gothic" w:cs="Malgun Gothic" w:eastAsia="Malgun Gothic" w:hAnsi="Malgun Gothic"/>
+                <w:b w:val="0"/>
+                <w:bCs w:val="0"/>
+                <w:color w:val="0000ff"/>
+                <w:rtl w:val="0"/>
+              </w:rPr>
+              <w:t xml:space="preserve">활동 단위 399 통과. 변경 시점 전체 단위 실행 8 실패 · 3,092 통과(실패는 변경과 무관함을 원인별로 확인). 이후 단계별 시험 13·14·33·42·46 통과, 통합 130 통과</w:t>
+            </w:r>
+          </w:p>
+        </w:tc>
+        <w:tc>
+          <w:tcPr>
+            <w:tcBorders>
+              <w:top w:color="808080" w:space="0" w:sz="7" w:val="single"/>
+              <w:left w:color="808080" w:space="0" w:sz="7" w:val="single"/>
+              <w:bottom w:color="808080" w:space="0" w:sz="7" w:val="single"/>
+              <w:right w:color="808080" w:space="0" w:sz="7" w:val="single"/>
+            </w:tcBorders>
+            <w:tcMar>
+              <w:top w:w="100.0" w:type="dxa"/>
+              <w:left w:w="100.0" w:type="dxa"/>
+              <w:bottom w:w="100.0" w:type="dxa"/>
+              <w:right w:w="100.0" w:type="dxa"/>
+            </w:tcMar>
+            <w:vAlign w:val="top"/>
+          </w:tcPr>
+          <w:p>
+            <w:pPr>
+              <w:spacing w:after="0" w:before="0" w:line="240" w:lineRule="auto"/>
+              <w:jc w:val="center"/>
+              <w:rPr>
+                <w:rFonts w:ascii="Malgun Gothic" w:cs="Malgun Gothic" w:eastAsia="Malgun Gothic" w:hAnsi="Malgun Gothic"/>
+                <w:b w:val="0"/>
+                <w:bCs w:val="0"/>
+                <w:color w:val="0000ff"/>
+              </w:rPr>
+            </w:pPr>
+            <w:r>
+              <w:rPr>
+                <w:rFonts w:ascii="Malgun Gothic" w:cs="Malgun Gothic" w:eastAsia="Malgun Gothic" w:hAnsi="Malgun Gothic"/>
+                <w:b w:val="0"/>
+                <w:bCs w:val="0"/>
+                <w:color w:val="0000ff"/>
+                <w:rtl w:val="0"/>
+              </w:rPr>
+              <w:t xml:space="preserve">컬럼 29개로 정합, 기존 값은 백업과 대조해 바뀐 값 0. 읽던 코드 4곳 함께 수정. TourAPI 호출 한도·재시도 시험 추가</w:t>
             </w:r>
           </w:p>
         </w:tc>

</xml_diff>

<commit_message>
docs(activity): add reproduction-condition note, describe LLM as background shadow (rule drives screen)
Co-Authored-By: Claude Sonnet 5.5 <noreply@anthropic.com>
</commit_message>
<xml_diff>
--- a/docs/activity/산출물/멀티에이전트_테스트_계획_및_결과_보고서_활동에이전트_2026-10-14.docx
+++ b/docs/activity/산출물/멀티에이전트_테스트_계획_및_결과_보고서_활동에이전트_2026-10-14.docx
@@ -1346,6 +1346,32 @@
     </w:tbl>
     <w:p>
       <w:pPr>
+        <w:numPr>
+          <w:ilvl w:val="0"/>
+          <w:numId w:val="7"/>
+        </w:numPr>
+        <w:spacing w:after="0" w:afterAutospacing="0" w:before="240" w:lineRule="auto"/>
+        <w:ind w:left="720" w:hanging="360"/>
+        <w:rPr>
+          <w:rFonts w:ascii="Malgun Gothic" w:cs="Malgun Gothic" w:eastAsia="Malgun Gothic" w:hAnsi="Malgun Gothic"/>
+          <w:b w:val="0"/>
+          <w:bCs w:val="0"/>
+          <w:color w:val="0000ff"/>
+        </w:rPr>
+      </w:pPr>
+      <w:r>
+        <w:rPr>
+          <w:rFonts w:ascii="Malgun Gothic" w:cs="Malgun Gothic" w:eastAsia="Malgun Gothic" w:hAnsi="Malgun Gothic"/>
+          <w:b w:val="0"/>
+          <w:bCs w:val="0"/>
+          <w:color w:val="0000ff"/>
+          <w:rtl w:val="0"/>
+        </w:rPr>
+        <w:t xml:space="preserve">재현 조건: 본 결과는 2026-10-14 로컬 개발 환경(PostgreSQL 16.15 + pgvector 0.8.6, 마이그레이션 전체 적용, 브랜치 role-activity-b)에서 측정했다. 다른 환경에서는 DB 적재 상태(문서 적재 여부), 마이그레이션 적용 여부, 설치 패키지, API 키와 모드 설정에 따라 시험 건수와 검색·판정 결과가 달라질 수 있다.</w:t>
+      </w:r>
+    </w:p>
+    <w:p>
+      <w:pPr>
         <w:pStyle w:val="Heading3"/>
         <w:keepNext w:val="0"/>
         <w:keepLines w:val="0"/>
@@ -1475,7 +1501,7 @@
           <w:color w:val="0000ff"/>
           <w:rtl w:val="0"/>
         </w:rPr>
-        <w:t xml:space="preserve">LLM 판정 보조(activity_judge): 규칙이 읽지 못하는 원문(휴무·운영시간·재난 문구)만 한 번 해석한다. 기본은 규칙, LLM 은 섀도(기록만)이며 켜도 근거(인용)가 있어야 쓴다.</w:t>
+        <w:t xml:space="preserve">LLM 판정 보조(activity_judge): 지금 화면에 나가는 판정은 규칙이다. LLM 은 설정에 따라 휴무·날씨 민감도·재난 영향·실시간 운영 상태·대체안 순서를 백그라운드에서 판정해 규칙과의 차이만 기록한다(섀도, 운영시간은 규칙만 사용). 기록이 쌓여 정확도가 확인되면 LLM 판정으로 교체할 계획이며, 인용(근거)이 없으면 어느 모드에서도 쓰지 않는다.</w:t>
       </w:r>
     </w:p>
     <w:p>
@@ -5506,7 +5532,7 @@
           <w:color w:val="0000ff"/>
           <w:rtl w:val="0"/>
         </w:rPr>
-        <w:t xml:space="preserve">개선 방향: LLM 은 규칙이 「모름」일 때와 섀도 기록(규칙과 어긋난 사례 수집)에만 쓰고, 웹 공지는 배치 저장값으로 읽는다. 라벨을 늘려 다시 측정한 뒤 모드(rule → shadow → llm)를 올릴지 정한다.</w:t>
+        <w:t xml:space="preserve">개선 방향: LLM 은 현재 섀도(백그라운드에서 돌려 규칙과의 차이를 기록)로만 쓰고, 웹 공지는 배치 저장값으로 읽는다. 기록이 쌓이고 사람 라벨로 정확도를 다시 확인한 뒤 신뢰할 수 있으면 모드(rule → shadow → llm)를 올려 LLM 판정으로 교체한다.</w:t>
       </w:r>
     </w:p>
     <w:p>
@@ -8404,6 +8430,32 @@
         </w:tc>
       </w:tr>
     </w:tbl>
+    <w:p>
+      <w:pPr>
+        <w:numPr>
+          <w:ilvl w:val="0"/>
+          <w:numId w:val="2"/>
+        </w:numPr>
+        <w:spacing w:after="0" w:afterAutospacing="0" w:before="240" w:lineRule="auto"/>
+        <w:ind w:left="720" w:hanging="360"/>
+        <w:rPr>
+          <w:rFonts w:ascii="Malgun Gothic" w:cs="Malgun Gothic" w:eastAsia="Malgun Gothic" w:hAnsi="Malgun Gothic"/>
+          <w:b w:val="0"/>
+          <w:bCs w:val="0"/>
+          <w:color w:val="0000ff"/>
+        </w:rPr>
+      </w:pPr>
+      <w:r>
+        <w:rPr>
+          <w:rFonts w:ascii="Malgun Gothic" w:cs="Malgun Gothic" w:eastAsia="Malgun Gothic" w:hAnsi="Malgun Gothic"/>
+          <w:b w:val="0"/>
+          <w:bCs w:val="0"/>
+          <w:color w:val="0000ff"/>
+          <w:rtl w:val="0"/>
+        </w:rPr>
+        <w:t xml:space="preserve">재현 조건: 본 결과는 2026-10-14 로컬 개발 환경(PostgreSQL 16.15 + pgvector 0.8.6, 마이그레이션 전체 적용, 브랜치 role-activity-b)에서 측정했다. 다른 환경에서는 DB 적재 상태(문서 적재 여부), 마이그레이션 적용 여부, 설치 패키지, API 키와 모드 설정에 따라 시험 건수와 검색·판정 결과가 달라질 수 있다.</w:t>
+      </w:r>
+    </w:p>
     <w:p>
       <w:pPr>
         <w:pStyle w:val="Heading3"/>

</xml_diff>

<commit_message>
docs(activity): include indoor/outdoor kind in LLM evaluation (52 labeled, 151/156) in test report
Co-Authored-By: Claude Sonnet 5.5 <noreply@anthropic.com>
</commit_message>
<xml_diff>
--- a/docs/activity/산출물/멀티에이전트_테스트_계획_및_결과_보고서_활동에이전트_2026-10-14.docx
+++ b/docs/activity/산출물/멀티에이전트_테스트_계획_및_결과_보고서_활동에이전트_2026-10-14.docx
@@ -4517,7 +4517,7 @@
           <w:color w:val="0000ff"/>
           <w:rtl w:val="0"/>
         </w:rPr>
-        <w:t xml:space="preserve">평가 대상: 외부 LLM gpt-5.4-nano(reasoning low, 웹 검색 사용)의 판정을 규칙과 비교. 사례 60건 × 3회 반복, 사람 검토 라벨(휴무·재난·운영시간 42사례) 기준.</w:t>
+        <w:t xml:space="preserve">평가 대상: 외부 LLM gpt-5.4-nano(reasoning low, 웹 검색 사용)의 판정을 규칙과 비교. 사례 60건 × 3회 반복, 사람 검토 라벨(52사례: 휴무 16·운영시간 14·실내외 10·재난 12) 기준.</w:t>
       </w:r>
     </w:p>
     <w:p>
@@ -5309,7 +5309,7 @@
                 <w:color w:val="0000ff"/>
                 <w:rtl w:val="0"/>
               </w:rPr>
-              <w:t xml:space="preserve">위험 오답(닫힌 곳을 열렸다고 하는 등)</w:t>
+              <w:t xml:space="preserve">실내외 판정 정확도</w:t>
             </w:r>
           </w:p>
         </w:tc>
@@ -5348,7 +5348,7 @@
                 <w:color w:val="0000ff"/>
                 <w:rtl w:val="0"/>
               </w:rPr>
-              <w:t xml:space="preserve">0건</w:t>
+              <w:t xml:space="preserve">50.0% (5/10 사례, 나머지는 「모름」)</w:t>
             </w:r>
           </w:p>
         </w:tc>
@@ -5387,7 +5387,170 @@
                 <w:color w:val="0000ff"/>
                 <w:rtl w:val="0"/>
               </w:rPr>
-              <w:t xml:space="preserve">5건 / 126관측</w:t>
+              <w:t xml:space="preserve">100.0% (30/30 관측)</w:t>
+            </w:r>
+          </w:p>
+        </w:tc>
+        <w:tc>
+          <w:tcPr>
+            <w:tcBorders>
+              <w:top w:color="808080" w:space="0" w:sz="7" w:val="single"/>
+              <w:left w:color="808080" w:space="0" w:sz="7" w:val="single"/>
+              <w:bottom w:color="808080" w:space="0" w:sz="7" w:val="single"/>
+              <w:right w:color="808080" w:space="0" w:sz="7" w:val="single"/>
+            </w:tcBorders>
+            <w:tcMar>
+              <w:top w:w="0.0" w:type="dxa"/>
+              <w:left w:w="0.0" w:type="dxa"/>
+              <w:bottom w:w="0.0" w:type="dxa"/>
+              <w:right w:w="0.0" w:type="dxa"/>
+            </w:tcMar>
+            <w:vAlign w:val="center"/>
+          </w:tcPr>
+          <w:p>
+            <w:pPr>
+              <w:spacing w:after="0" w:before="0" w:line="240" w:lineRule="auto"/>
+              <w:jc w:val="center"/>
+              <w:rPr>
+                <w:rFonts w:ascii="Malgun Gothic" w:cs="Malgun Gothic" w:eastAsia="Malgun Gothic" w:hAnsi="Malgun Gothic"/>
+                <w:b w:val="0"/>
+                <w:bCs w:val="0"/>
+                <w:color w:val="0000ff"/>
+              </w:rPr>
+            </w:pPr>
+            <w:r>
+              <w:rPr>
+                <w:rFonts w:ascii="Malgun Gothic" w:cs="Malgun Gothic" w:eastAsia="Malgun Gothic" w:hAnsi="Malgun Gothic"/>
+                <w:b w:val="0"/>
+                <w:bCs w:val="0"/>
+                <w:color w:val="0000ff"/>
+                <w:rtl w:val="0"/>
+              </w:rPr>
+              <w:t xml:space="preserve">+50.0%p</w:t>
+            </w:r>
+          </w:p>
+        </w:tc>
+      </w:tr>
+      <w:tr>
+        <w:trPr>
+          <w:cantSplit w:val="0"/>
+          <w:trHeight w:val="620.0000000000001" w:hRule="atLeast"/>
+          <w:tblHeader w:val="0"/>
+        </w:trPr>
+        <w:tc>
+          <w:tcPr>
+            <w:tcBorders>
+              <w:top w:color="808080" w:space="0" w:sz="7" w:val="single"/>
+              <w:left w:color="808080" w:space="0" w:sz="7" w:val="single"/>
+              <w:bottom w:color="808080" w:space="0" w:sz="7" w:val="single"/>
+              <w:right w:color="808080" w:space="0" w:sz="7" w:val="single"/>
+            </w:tcBorders>
+            <w:tcMar>
+              <w:top w:w="0.0" w:type="dxa"/>
+              <w:left w:w="0.0" w:type="dxa"/>
+              <w:bottom w:w="0.0" w:type="dxa"/>
+              <w:right w:w="0.0" w:type="dxa"/>
+            </w:tcMar>
+            <w:vAlign w:val="center"/>
+          </w:tcPr>
+          <w:p>
+            <w:pPr>
+              <w:spacing w:after="0" w:before="0" w:line="240" w:lineRule="auto"/>
+              <w:jc w:val="center"/>
+              <w:rPr>
+                <w:rFonts w:ascii="Malgun Gothic" w:cs="Malgun Gothic" w:eastAsia="Malgun Gothic" w:hAnsi="Malgun Gothic"/>
+                <w:b w:val="0"/>
+                <w:bCs w:val="0"/>
+                <w:color w:val="0000ff"/>
+              </w:rPr>
+            </w:pPr>
+            <w:r>
+              <w:rPr>
+                <w:rFonts w:ascii="Malgun Gothic" w:cs="Malgun Gothic" w:eastAsia="Malgun Gothic" w:hAnsi="Malgun Gothic"/>
+                <w:b w:val="0"/>
+                <w:bCs w:val="0"/>
+                <w:color w:val="0000ff"/>
+                <w:rtl w:val="0"/>
+              </w:rPr>
+              <w:t xml:space="preserve">위험 오답(닫힌 곳을 열렸다고 하는 등)</w:t>
+            </w:r>
+          </w:p>
+        </w:tc>
+        <w:tc>
+          <w:tcPr>
+            <w:tcBorders>
+              <w:top w:color="808080" w:space="0" w:sz="7" w:val="single"/>
+              <w:left w:color="808080" w:space="0" w:sz="7" w:val="single"/>
+              <w:bottom w:color="808080" w:space="0" w:sz="7" w:val="single"/>
+              <w:right w:color="808080" w:space="0" w:sz="7" w:val="single"/>
+            </w:tcBorders>
+            <w:tcMar>
+              <w:top w:w="0.0" w:type="dxa"/>
+              <w:left w:w="0.0" w:type="dxa"/>
+              <w:bottom w:w="0.0" w:type="dxa"/>
+              <w:right w:w="0.0" w:type="dxa"/>
+            </w:tcMar>
+            <w:vAlign w:val="center"/>
+          </w:tcPr>
+          <w:p>
+            <w:pPr>
+              <w:spacing w:after="0" w:before="0" w:line="240" w:lineRule="auto"/>
+              <w:jc w:val="center"/>
+              <w:rPr>
+                <w:rFonts w:ascii="Malgun Gothic" w:cs="Malgun Gothic" w:eastAsia="Malgun Gothic" w:hAnsi="Malgun Gothic"/>
+                <w:b w:val="0"/>
+                <w:bCs w:val="0"/>
+                <w:color w:val="0000ff"/>
+              </w:rPr>
+            </w:pPr>
+            <w:r>
+              <w:rPr>
+                <w:rFonts w:ascii="Malgun Gothic" w:cs="Malgun Gothic" w:eastAsia="Malgun Gothic" w:hAnsi="Malgun Gothic"/>
+                <w:b w:val="0"/>
+                <w:bCs w:val="0"/>
+                <w:color w:val="0000ff"/>
+                <w:rtl w:val="0"/>
+              </w:rPr>
+              <w:t xml:space="preserve">0건</w:t>
+            </w:r>
+          </w:p>
+        </w:tc>
+        <w:tc>
+          <w:tcPr>
+            <w:tcBorders>
+              <w:top w:color="808080" w:space="0" w:sz="7" w:val="single"/>
+              <w:left w:color="808080" w:space="0" w:sz="7" w:val="single"/>
+              <w:bottom w:color="808080" w:space="0" w:sz="7" w:val="single"/>
+              <w:right w:color="808080" w:space="0" w:sz="7" w:val="single"/>
+            </w:tcBorders>
+            <w:tcMar>
+              <w:top w:w="0.0" w:type="dxa"/>
+              <w:left w:w="0.0" w:type="dxa"/>
+              <w:bottom w:w="0.0" w:type="dxa"/>
+              <w:right w:w="0.0" w:type="dxa"/>
+            </w:tcMar>
+            <w:vAlign w:val="center"/>
+          </w:tcPr>
+          <w:p>
+            <w:pPr>
+              <w:spacing w:after="0" w:before="0" w:line="240" w:lineRule="auto"/>
+              <w:jc w:val="center"/>
+              <w:rPr>
+                <w:rFonts w:ascii="Malgun Gothic" w:cs="Malgun Gothic" w:eastAsia="Malgun Gothic" w:hAnsi="Malgun Gothic"/>
+                <w:b w:val="0"/>
+                <w:bCs w:val="0"/>
+                <w:color w:val="0000ff"/>
+              </w:rPr>
+            </w:pPr>
+            <w:r>
+              <w:rPr>
+                <w:rFonts w:ascii="Malgun Gothic" w:cs="Malgun Gothic" w:eastAsia="Malgun Gothic" w:hAnsi="Malgun Gothic"/>
+                <w:b w:val="0"/>
+                <w:bCs w:val="0"/>
+                <w:color w:val="0000ff"/>
+                <w:rtl w:val="0"/>
+              </w:rPr>
+              <w:t xml:space="preserve">5건 / 156관측</w:t>
             </w:r>
           </w:p>
         </w:tc>
@@ -5506,7 +5669,7 @@
           <w:color w:val="0000ff"/>
           <w:rtl w:val="0"/>
         </w:rPr>
-        <w:t xml:space="preserve">한계점: 사례가 적고(라벨 42사례) 반복 3회는 같은 사례의 반복이라 독립 표본이 아니다. 위험 오답이 규칙 0건 대비 LLM 5건이므로 LLM 을 판정의 주 경로로 쓰지 않는다. 실운영 정확도·장기 변동은 측정하지 못했다.</w:t>
+        <w:t xml:space="preserve">한계점: 사례가 적고(라벨 52사례) 반복 3회는 같은 사례의 반복이라 독립 표본이 아니다. 위험 오답이 규칙 0건 대비 LLM 5건(전부 「풀어 주는 쪽」)이므로 LLM 을 판정의 주 경로로 쓰지 않는다. 실운영 정확도·장기 변동은 측정하지 못했다.</w:t>
       </w:r>
     </w:p>
     <w:p>
@@ -8229,7 +8392,7 @@
                 <w:color w:val="0000ff"/>
                 <w:rtl w:val="0"/>
               </w:rPr>
-              <w:t xml:space="preserve">LLM 판정 평가(휴무·재난·운영시간)</w:t>
+              <w:t xml:space="preserve">LLM 판정 평가(휴무·운영시간·실내외·재난)</w:t>
             </w:r>
           </w:p>
         </w:tc>
@@ -8268,7 +8431,7 @@
                 <w:color w:val="0000ff"/>
                 <w:rtl w:val="0"/>
               </w:rPr>
-              <w:t xml:space="preserve">126</w:t>
+              <w:t xml:space="preserve">156</w:t>
             </w:r>
           </w:p>
         </w:tc>
@@ -8307,7 +8470,7 @@
                 <w:color w:val="0000ff"/>
                 <w:rtl w:val="0"/>
               </w:rPr>
-              <w:t xml:space="preserve">121</w:t>
+              <w:t xml:space="preserve">151</w:t>
             </w:r>
           </w:p>
         </w:tc>
@@ -8385,7 +8548,7 @@
                 <w:color w:val="0000ff"/>
                 <w:rtl w:val="0"/>
               </w:rPr>
-              <w:t xml:space="preserve">96.0%</w:t>
+              <w:t xml:space="preserve">96.8%</w:t>
             </w:r>
           </w:p>
         </w:tc>

</xml_diff>